<commit_message>
New changes was being made to the UI and also to the fastapi backend as well.
Currently the fastapi that we will be using is the one that will be fastapi.
</commit_message>
<xml_diff>
--- a/sample-documents/UMS_PowerBI_Fabric_Planning_Design_v1.1.docx
+++ b/sample-documents/UMS_PowerBI_Fabric_Planning_Design_v1.1.docx
@@ -1523,6 +1523,42 @@
         </w:rPr>
         <w:t xml:space="preserve">as-is” by any interested party. You may copy, adapt, and redistribute this document for non-commercial use or for your own internal use in a commercial setting. </w:t>
       </w:r>
+      <w:r>
+        <w:rPr>
+          <w:rFonts w:ascii="Segoe UI" w:eastAsia="MS Mincho" w:hAnsi="Segoe UI" w:cs="Segoe UI"/>
+          <w:kern w:val="0"/>
+          <w:sz w:val="14"/>
+          <w:szCs w:val="20"/>
+          <w:lang w:val="en-US"/>
+          <w14:ligatures w14:val="none"/>
+        </w:rPr>
+        <w:t>However, you may not republish this document, nor may you publish or di</w:t>
+      </w:r>
+      <w:r>
+        <w:rPr>
+          <w:rFonts w:ascii="Segoe UI" w:eastAsia="MS Mincho" w:hAnsi="Segoe UI" w:cs="Segoe UI"/>
+          <w:kern w:val="0"/>
+          <w:sz w:val="14"/>
+          <w:szCs w:val="14"/>
+          <w:lang w:val="en-US"/>
+          <w14:ligatures w14:val="none"/>
+        </w:rPr>
+        <w:t xml:space="preserve">stribute any adaptation of this document for other than non-commercial use or your own internal use, without first obtaining express written approval from Enfrasys Solutions Sdn Bhd. </w:t>
+      </w:r>
+    </w:p>
+    <w:p>
+      <w:pPr>
+        <w:spacing w:line="259" w:lineRule="auto"/>
+        <w:jc w:val="both"/>
+        <w:rPr>
+          <w:rFonts w:ascii="Segoe UI" w:eastAsia="DengXian" w:hAnsi="Segoe UI" w:cs="Segoe UI"/>
+          <w:kern w:val="0"/>
+          <w:sz w:val="22"/>
+          <w:szCs w:val="22"/>
+          <w:lang w:val="en-US" w:eastAsia="zh-CN"/>
+          <w14:ligatures w14:val="none"/>
+        </w:rPr>
+      </w:pPr>
     </w:p>
     <w:p>
       <w:pPr>
@@ -1534,6 +1570,7 @@
         <w:jc w:val="both"/>
         <w:rPr>
           <w:rFonts w:ascii="Segoe UI" w:eastAsia="MS Mincho" w:hAnsi="Segoe UI" w:cs="Segoe UI"/>
+          <w:b/>
           <w:kern w:val="0"/>
           <w:sz w:val="14"/>
           <w:szCs w:val="14"/>
@@ -1544,39 +1581,15 @@
       <w:r>
         <w:rPr>
           <w:rFonts w:ascii="Segoe UI" w:eastAsia="MS Mincho" w:hAnsi="Segoe UI" w:cs="Segoe UI"/>
+          <w:b/>
           <w:kern w:val="0"/>
           <w:sz w:val="14"/>
           <w:szCs w:val="20"/>
           <w:lang w:val="en-US"/>
           <w14:ligatures w14:val="none"/>
         </w:rPr>
-        <w:t>However, you may not republish this document, nor may you publish or di</w:t>
-      </w:r>
-      <w:r>
-        <w:rPr>
-          <w:rFonts w:ascii="Segoe UI" w:eastAsia="MS Mincho" w:hAnsi="Segoe UI" w:cs="Segoe UI"/>
-          <w:kern w:val="0"/>
-          <w:sz w:val="14"/>
-          <w:szCs w:val="14"/>
-          <w:lang w:val="en-US"/>
-          <w14:ligatures w14:val="none"/>
-        </w:rPr>
-        <w:t xml:space="preserve">stribute any adaptation of this document for other than non-commercial use or your own internal use, without first obtaining express written approval from Enfrasys Solutions Sdn Bhd. </w:t>
-      </w:r>
-    </w:p>
-    <w:p>
-      <w:pPr>
-        <w:spacing w:line="259" w:lineRule="auto"/>
-        <w:jc w:val="both"/>
-        <w:rPr>
-          <w:rFonts w:ascii="Segoe UI" w:eastAsia="DengXian" w:hAnsi="Segoe UI" w:cs="Segoe UI"/>
-          <w:kern w:val="0"/>
-          <w:sz w:val="22"/>
-          <w:szCs w:val="22"/>
-          <w:lang w:val="en-US" w:eastAsia="zh-CN"/>
-          <w14:ligatures w14:val="none"/>
-        </w:rPr>
-      </w:pPr>
+        <w:t>Disclaimer</w:t>
+      </w:r>
     </w:p>
     <w:p>
       <w:pPr>
@@ -1588,7 +1601,6 @@
         <w:jc w:val="both"/>
         <w:rPr>
           <w:rFonts w:ascii="Segoe UI" w:eastAsia="MS Mincho" w:hAnsi="Segoe UI" w:cs="Segoe UI"/>
-          <w:b/>
           <w:kern w:val="0"/>
           <w:sz w:val="14"/>
           <w:szCs w:val="14"/>
@@ -1599,15 +1611,50 @@
       <w:r>
         <w:rPr>
           <w:rFonts w:ascii="Segoe UI" w:eastAsia="MS Mincho" w:hAnsi="Segoe UI" w:cs="Segoe UI"/>
-          <w:b/>
           <w:kern w:val="0"/>
           <w:sz w:val="14"/>
           <w:szCs w:val="20"/>
           <w:lang w:val="en-US"/>
           <w14:ligatures w14:val="none"/>
         </w:rPr>
-        <w:t>Disclaimer</w:t>
-      </w:r>
+        <w:t>The Author and Enfrasys Solutions Sdn Bhd shall have neith</w:t>
+      </w:r>
+      <w:r>
+        <w:rPr>
+          <w:rFonts w:ascii="Segoe UI" w:eastAsia="MS Mincho" w:hAnsi="Segoe UI" w:cs="Segoe UI"/>
+          <w:kern w:val="0"/>
+          <w:sz w:val="14"/>
+          <w:szCs w:val="14"/>
+          <w:lang w:val="en-US"/>
+          <w14:ligatures w14:val="none"/>
+        </w:rPr>
+        <w:t xml:space="preserve">er liability nor responsibility to any person or entity with respect to the loss or damages arising from the information contained in this work. This work may include inaccuracies or typographical errors and solely represent the opinions of the Author. Changes are periodically made to this document without notice. </w:t>
+      </w:r>
+      <w:r>
+        <w:rPr>
+          <w:rFonts w:ascii="Segoe UI" w:eastAsia="MS Mincho" w:hAnsi="Segoe UI" w:cs="Segoe UI"/>
+          <w:kern w:val="0"/>
+          <w:sz w:val="14"/>
+          <w:szCs w:val="20"/>
+          <w:lang w:val="en-US"/>
+          <w14:ligatures w14:val="none"/>
+        </w:rPr>
+        <w:t>Due to the rapid growth of various technologies, the Author and Enfrasys Solutions Sdn Bhd cannot guarantee the accuracy of the information presented after the date of publication.</w:t>
+      </w:r>
+    </w:p>
+    <w:p>
+      <w:pPr>
+        <w:spacing w:line="259" w:lineRule="auto"/>
+        <w:jc w:val="both"/>
+        <w:rPr>
+          <w:rFonts w:ascii="Segoe UI" w:eastAsia="DengXian" w:hAnsi="Segoe UI" w:cs="Segoe UI"/>
+          <w:kern w:val="0"/>
+          <w:sz w:val="22"/>
+          <w:szCs w:val="22"/>
+          <w:lang w:val="en-US" w:eastAsia="zh-CN"/>
+          <w14:ligatures w14:val="none"/>
+        </w:rPr>
+      </w:pPr>
     </w:p>
     <w:p>
       <w:pPr>
@@ -1619,6 +1666,8 @@
         <w:jc w:val="both"/>
         <w:rPr>
           <w:rFonts w:ascii="Segoe UI" w:eastAsia="MS Mincho" w:hAnsi="Segoe UI" w:cs="Segoe UI"/>
+          <w:b/>
+          <w:bCs/>
           <w:kern w:val="0"/>
           <w:sz w:val="14"/>
           <w:szCs w:val="14"/>
@@ -1629,24 +1678,14 @@
       <w:r>
         <w:rPr>
           <w:rFonts w:ascii="Segoe UI" w:eastAsia="MS Mincho" w:hAnsi="Segoe UI" w:cs="Segoe UI"/>
+          <w:b/>
           <w:kern w:val="0"/>
           <w:sz w:val="14"/>
           <w:szCs w:val="20"/>
           <w:lang w:val="en-US"/>
           <w14:ligatures w14:val="none"/>
         </w:rPr>
-        <w:t>The Author and Enfrasys Solutions Sdn Bhd shall have neith</w:t>
-      </w:r>
-      <w:r>
-        <w:rPr>
-          <w:rFonts w:ascii="Segoe UI" w:eastAsia="MS Mincho" w:hAnsi="Segoe UI" w:cs="Segoe UI"/>
-          <w:kern w:val="0"/>
-          <w:sz w:val="14"/>
-          <w:szCs w:val="14"/>
-          <w:lang w:val="en-US"/>
-          <w14:ligatures w14:val="none"/>
-        </w:rPr>
-        <w:t xml:space="preserve">er liability nor responsibility to any person or entity with respect to the loss or damages arising from the information contained in this work. This work may include inaccuracies or typographical errors and solely represent the opinions of the Author. Changes are periodically made to this document without notice. </w:t>
+        <w:t>Trademarks</w:t>
       </w:r>
     </w:p>
     <w:p>
@@ -1675,122 +1714,18 @@
           <w:lang w:val="en-US"/>
           <w14:ligatures w14:val="none"/>
         </w:rPr>
-        <w:t>Due to the rapid growth of various technologies, the Author and Enfrasys Solutions Sdn Bhd cannot guarantee the accuracy of the information presented after the date of publication.</w:t>
-      </w:r>
-    </w:p>
-    <w:p>
-      <w:pPr>
-        <w:spacing w:line="259" w:lineRule="auto"/>
-        <w:jc w:val="both"/>
-        <w:rPr>
-          <w:rFonts w:ascii="Segoe UI" w:eastAsia="DengXian" w:hAnsi="Segoe UI" w:cs="Segoe UI"/>
-          <w:kern w:val="0"/>
-          <w:sz w:val="22"/>
-          <w:szCs w:val="22"/>
-          <w:lang w:val="en-US" w:eastAsia="zh-CN"/>
-          <w14:ligatures w14:val="none"/>
-        </w:rPr>
-      </w:pPr>
-    </w:p>
-    <w:p>
-      <w:pPr>
-        <w:tabs>
-          <w:tab w:val="left" w:pos="4140"/>
-        </w:tabs>
-        <w:spacing w:after="0" w:line="240" w:lineRule="auto"/>
-        <w:ind w:left="3060"/>
-        <w:jc w:val="both"/>
+        <w:t>T</w:t>
+      </w:r>
+      <w:r>
         <w:rPr>
           <w:rFonts w:ascii="Segoe UI" w:eastAsia="MS Mincho" w:hAnsi="Segoe UI" w:cs="Segoe UI"/>
-          <w:b/>
-          <w:bCs/>
           <w:kern w:val="0"/>
           <w:sz w:val="14"/>
           <w:szCs w:val="14"/>
           <w:lang w:val="en-US"/>
           <w14:ligatures w14:val="none"/>
         </w:rPr>
-      </w:pPr>
-      <w:r>
-        <w:rPr>
-          <w:rFonts w:ascii="Segoe UI" w:eastAsia="MS Mincho" w:hAnsi="Segoe UI" w:cs="Segoe UI"/>
-          <w:b/>
-          <w:kern w:val="0"/>
-          <w:sz w:val="14"/>
-          <w:szCs w:val="20"/>
-          <w:lang w:val="en-US"/>
-          <w14:ligatures w14:val="none"/>
-        </w:rPr>
-        <w:t>Trademarks</w:t>
-      </w:r>
-    </w:p>
-    <w:p>
-      <w:pPr>
-        <w:tabs>
-          <w:tab w:val="left" w:pos="4140"/>
-        </w:tabs>
-        <w:spacing w:after="0" w:line="240" w:lineRule="auto"/>
-        <w:ind w:left="3060"/>
-        <w:jc w:val="both"/>
-        <w:rPr>
-          <w:rFonts w:ascii="Segoe UI" w:eastAsia="MS Mincho" w:hAnsi="Segoe UI" w:cs="Segoe UI"/>
-          <w:kern w:val="0"/>
-          <w:sz w:val="14"/>
-          <w:szCs w:val="14"/>
-          <w:lang w:val="en-US"/>
-          <w14:ligatures w14:val="none"/>
-        </w:rPr>
-      </w:pPr>
-      <w:r>
-        <w:rPr>
-          <w:rFonts w:ascii="Segoe UI" w:eastAsia="MS Mincho" w:hAnsi="Segoe UI" w:cs="Segoe UI"/>
-          <w:kern w:val="0"/>
-          <w:sz w:val="14"/>
-          <w:szCs w:val="20"/>
-          <w:lang w:val="en-US"/>
-          <w14:ligatures w14:val="none"/>
-        </w:rPr>
-        <w:t>T</w:t>
-      </w:r>
-      <w:r>
-        <w:rPr>
-          <w:rFonts w:ascii="Segoe UI" w:eastAsia="MS Mincho" w:hAnsi="Segoe UI" w:cs="Segoe UI"/>
-          <w:kern w:val="0"/>
-          <w:sz w:val="14"/>
-          <w:szCs w:val="14"/>
-          <w:lang w:val="en-US"/>
-          <w14:ligatures w14:val="none"/>
-        </w:rPr>
-        <w:t xml:space="preserve">he names of actual companies, service marks, trademarks or products mentioned herein may be the trademarks of their respective owners. Use of terms within this work should not be regarded as affecting the validity of any trademark or service mark. </w:t>
-      </w:r>
-    </w:p>
-    <w:p>
-      <w:pPr>
-        <w:tabs>
-          <w:tab w:val="left" w:pos="4140"/>
-        </w:tabs>
-        <w:spacing w:after="0" w:line="240" w:lineRule="auto"/>
-        <w:ind w:left="3060"/>
-        <w:jc w:val="both"/>
-        <w:rPr>
-          <w:rFonts w:ascii="Segoe UI" w:eastAsia="MS Mincho" w:hAnsi="Segoe UI" w:cs="Segoe UI"/>
-          <w:kern w:val="0"/>
-          <w:sz w:val="14"/>
-          <w:szCs w:val="14"/>
-          <w:lang w:val="en-US"/>
-          <w14:ligatures w14:val="none"/>
-        </w:rPr>
-      </w:pPr>
-      <w:r>
-        <w:rPr>
-          <w:rFonts w:ascii="Segoe UI" w:eastAsia="MS Mincho" w:hAnsi="Segoe UI" w:cs="Segoe UI"/>
-          <w:kern w:val="0"/>
-          <w:sz w:val="14"/>
-          <w:szCs w:val="14"/>
-          <w:lang w:val="en-US"/>
-          <w14:ligatures w14:val="none"/>
-        </w:rPr>
-        <w:t>Enfrasys Consulting may have patents, patent applications, trademarks, copyrights, or other intellectual property rights covering subject matter in this document. Except as expressly provided in any written license agreement from Enfrasys Solutions Sdn Bhd; the furnishing of this document does not give you any license to those items.</w:t>
+        <w:t>he names of actual companies, service marks, trademarks or products mentioned herein may be the trademarks of their respective owners. Use of terms within this work should not be regarded as affecting the validity of any trademark or service mark. Enfrasys Consulting may have patents, patent applications, trademarks, copyrights, or other intellectual property rights covering subject matter in this document. Except as expressly provided in any written license agreement from Enfrasys Solutions Sdn Bhd; the furnishing of this document does not give you any license to those items.</w:t>
       </w:r>
     </w:p>
     <w:p>
@@ -11866,10 +11801,21 @@
           <w14:ligatures w14:val="none"/>
         </w:rPr>
         <w:lastRenderedPageBreak/>
-        <w:t>Project Overview</w:t>
+        <w:t>Project Overvie</w:t>
       </w:r>
       <w:bookmarkEnd w:id="8"/>
       <w:bookmarkEnd w:id="9"/>
+      <w:r>
+        <w:rPr>
+          <w:rFonts w:ascii="Segoe UI" w:hAnsi="Segoe UI" w:cs="Segoe UI"/>
+          <w:kern w:val="0"/>
+          <w:sz w:val="28"/>
+          <w:szCs w:val="26"/>
+          <w:lang w:val="en-US" w:eastAsia="zh-CN"/>
+          <w14:ligatures w14:val="none"/>
+        </w:rPr>
+        <w:t>w</w:t>
+      </w:r>
     </w:p>
     <w:p>
       <w:pPr>
@@ -45203,6 +45149,25 @@
 </file>
 
 <file path=customXml/item1.xml><?xml version="1.0" encoding="utf-8"?>
+<b:Sources xmlns:b="http://schemas.openxmlformats.org/officeDocument/2006/bibliography" xmlns="http://schemas.openxmlformats.org/officeDocument/2006/bibliography" SelectedStyle="\APASixthEditionOfficeOnline.xsl" StyleName="APA" Version="6"/>
+</file>
+
+<file path=customXml/item2.xml><?xml version="1.0" encoding="utf-8"?>
+<?mso-contentType ?>
+<FormTemplates xmlns="http://schemas.microsoft.com/sharepoint/v3/contenttype/forms">
+  <Display>DocumentLibraryForm</Display>
+  <Edit>DocumentLibraryForm</Edit>
+  <New>DocumentLibraryForm</New>
+</FormTemplates>
+</file>
+
+<file path=customXml/item3.xml><?xml version="1.0" encoding="utf-8"?>
+<p:properties xmlns:p="http://schemas.microsoft.com/office/2006/metadata/properties" xmlns:xsi="http://www.w3.org/2001/XMLSchema-instance" xmlns:pc="http://schemas.microsoft.com/office/infopath/2007/PartnerControls">
+  <documentManagement/>
+</p:properties>
+</file>
+
+<file path=customXml/item4.xml><?xml version="1.0" encoding="utf-8"?>
 <ct:contentTypeSchema xmlns:ct="http://schemas.microsoft.com/office/2006/metadata/contentType" xmlns:ma="http://schemas.microsoft.com/office/2006/metadata/properties/metaAttributes" ct:_="" ma:_="" ma:contentTypeName="Document" ma:contentTypeID="0x01010085C90FEABA01574E94F222950F0C31FD" ma:contentTypeVersion="3" ma:contentTypeDescription="Create a new document." ma:contentTypeScope="" ma:versionID="3f74f9d818e6377a773cce7d698d7e32">
   <xsd:schema xmlns:xsd="http://www.w3.org/2001/XMLSchema" xmlns:xs="http://www.w3.org/2001/XMLSchema" xmlns:p="http://schemas.microsoft.com/office/2006/metadata/properties" xmlns:ns2="c10ce1e6-2e59-43d6-bc20-07a30a27bcae" targetNamespace="http://schemas.microsoft.com/office/2006/metadata/properties" ma:root="true" ma:fieldsID="3e16b53508b9ffbab11f7b130802d601" ns2:_="">
     <xsd:import namespace="c10ce1e6-2e59-43d6-bc20-07a30a27bcae"/>
@@ -45340,26 +45305,32 @@
 </ct:contentTypeSchema>
 </file>
 
-<file path=customXml/item2.xml><?xml version="1.0" encoding="utf-8"?>
-<p:properties xmlns:p="http://schemas.microsoft.com/office/2006/metadata/properties" xmlns:xsi="http://www.w3.org/2001/XMLSchema-instance" xmlns:pc="http://schemas.microsoft.com/office/infopath/2007/PartnerControls">
-  <documentManagement/>
-</p:properties>
+<file path=customXml/itemProps1.xml><?xml version="1.0" encoding="utf-8"?>
+<ds:datastoreItem xmlns:ds="http://schemas.openxmlformats.org/officeDocument/2006/customXml" ds:itemID="{A82C1AF4-78FE-4587-AE7C-939CDDF82EB3}">
+  <ds:schemaRefs>
+    <ds:schemaRef ds:uri="http://schemas.openxmlformats.org/officeDocument/2006/bibliography"/>
+  </ds:schemaRefs>
+</ds:datastoreItem>
 </file>
 
-<file path=customXml/item3.xml><?xml version="1.0" encoding="utf-8"?>
-<?mso-contentType ?>
-<FormTemplates xmlns="http://schemas.microsoft.com/sharepoint/v3/contenttype/forms">
-  <Display>DocumentLibraryForm</Display>
-  <Edit>DocumentLibraryForm</Edit>
-  <New>DocumentLibraryForm</New>
-</FormTemplates>
+<file path=customXml/itemProps2.xml><?xml version="1.0" encoding="utf-8"?>
+<ds:datastoreItem xmlns:ds="http://schemas.openxmlformats.org/officeDocument/2006/customXml" ds:itemID="{C93A1584-1F3A-44D1-A14E-32307374A481}">
+  <ds:schemaRefs>
+    <ds:schemaRef ds:uri="http://schemas.microsoft.com/sharepoint/v3/contenttype/forms"/>
+  </ds:schemaRefs>
+</ds:datastoreItem>
 </file>
 
-<file path=customXml/item4.xml><?xml version="1.0" encoding="utf-8"?>
-<b:Sources xmlns:b="http://schemas.openxmlformats.org/officeDocument/2006/bibliography" xmlns="http://schemas.openxmlformats.org/officeDocument/2006/bibliography" SelectedStyle="\APASixthEditionOfficeOnline.xsl" StyleName="APA" Version="6"/>
+<file path=customXml/itemProps3.xml><?xml version="1.0" encoding="utf-8"?>
+<ds:datastoreItem xmlns:ds="http://schemas.openxmlformats.org/officeDocument/2006/customXml" ds:itemID="{8F70B746-9169-4A9D-BAEC-CBE74BD2F9DF}">
+  <ds:schemaRefs>
+    <ds:schemaRef ds:uri="http://schemas.microsoft.com/office/2006/metadata/properties"/>
+    <ds:schemaRef ds:uri="http://schemas.microsoft.com/office/infopath/2007/PartnerControls"/>
+  </ds:schemaRefs>
+</ds:datastoreItem>
 </file>
 
-<file path=customXml/itemProps1.xml><?xml version="1.0" encoding="utf-8"?>
+<file path=customXml/itemProps4.xml><?xml version="1.0" encoding="utf-8"?>
 <ds:datastoreItem xmlns:ds="http://schemas.openxmlformats.org/officeDocument/2006/customXml" ds:itemID="{FA55BFAA-E444-45BB-B8D0-8563BE85B483}">
   <ds:schemaRefs>
     <ds:schemaRef ds:uri="http://schemas.microsoft.com/office/2006/metadata/contentType"/>
@@ -45375,29 +45346,4 @@
     <ds:schemaRef ds:uri="http://schemas.microsoft.com/internal/obd"/>
   </ds:schemaRefs>
 </ds:datastoreItem>
-</file>
-
-<file path=customXml/itemProps2.xml><?xml version="1.0" encoding="utf-8"?>
-<ds:datastoreItem xmlns:ds="http://schemas.openxmlformats.org/officeDocument/2006/customXml" ds:itemID="{8F70B746-9169-4A9D-BAEC-CBE74BD2F9DF}">
-  <ds:schemaRefs>
-    <ds:schemaRef ds:uri="http://schemas.microsoft.com/office/2006/metadata/properties"/>
-    <ds:schemaRef ds:uri="http://schemas.microsoft.com/office/infopath/2007/PartnerControls"/>
-  </ds:schemaRefs>
-</ds:datastoreItem>
-</file>
-
-<file path=customXml/itemProps3.xml><?xml version="1.0" encoding="utf-8"?>
-<ds:datastoreItem xmlns:ds="http://schemas.openxmlformats.org/officeDocument/2006/customXml" ds:itemID="{C93A1584-1F3A-44D1-A14E-32307374A481}">
-  <ds:schemaRefs>
-    <ds:schemaRef ds:uri="http://schemas.microsoft.com/sharepoint/v3/contenttype/forms"/>
-  </ds:schemaRefs>
-</ds:datastoreItem>
-</file>
-
-<file path=customXml/itemProps4.xml><?xml version="1.0" encoding="utf-8"?>
-<ds:datastoreItem xmlns:ds="http://schemas.openxmlformats.org/officeDocument/2006/customXml" ds:itemID="{A82C1AF4-78FE-4587-AE7C-939CDDF82EB3}">
-  <ds:schemaRefs>
-    <ds:schemaRef ds:uri="http://schemas.openxmlformats.org/officeDocument/2006/bibliography"/>
-  </ds:schemaRefs>
-</ds:datastoreItem>
 </file>
</xml_diff>